<commit_message>
The redo is the same activity, not a different one
Step 2 told students to show each card and type what the learner says. That is
not what anyone did in the room -- the Doer typed their own answers on a laptop
handed to them. A redo at home is the same move with a different person: hand
the laptop over, they type, you sit beside them and ask how do you know.

Every step is starred, with a line saying so under the heading. The list is not
an assignment to work through; it is the record of what already happened, kept
for the two or three people who want fresh data.

The outline carried the same wrong claim -- a warning that with a learner you
would be the one typing. Gone.

Co-Authored-By: Claude Opus 5 (1M context) <noreply@anthropic.com>
</commit_message>
<xml_diff>
--- a/week-3-geometry-van-hiele/week-3-pedagogical-excursion.docx
+++ b/week-3-geometry-van-hiele/week-3-pedagogical-excursion.docx
@@ -139,10 +139,19 @@
       <w:r>
         <w:rPr>
           <w:rFonts w:ascii="Calibri" w:hAnsi="Calibri"/>
+          <w:i/>
+        </w:rPr>
+        <w:t xml:space="preserve">★ You already did every step below, in class. They are written out only for anyone collecting fresh data — if the answers you brought home are good enough to read, you are done.</w:t>
+      </w:r>
+    </w:p>
+    <w:p>
+      <w:r>
+        <w:rPr>
+          <w:rFonts w:ascii="Calibri" w:hAnsi="Calibri"/>
           <w:b/>
           <w:color w:val="1F4E96"/>
         </w:rPr>
-        <w:t xml:space="preserve">1.  </w:t>
+        <w:t xml:space="preserve">★ 1.  </w:t>
       </w:r>
       <w:r>
         <w:rPr>
@@ -165,7 +174,7 @@
           <w:b/>
           <w:color w:val="1F4E96"/>
         </w:rPr>
-        <w:t xml:space="preserve">2.  </w:t>
+        <w:t xml:space="preserve">★ 2.  </w:t>
       </w:r>
       <w:r>
         <w:rPr>
@@ -178,7 +187,7 @@
         <w:rPr>
           <w:rFonts w:ascii="Calibri" w:hAnsi="Calibri"/>
         </w:rPr>
-        <w:t>Show each card, ask “What do you see?”, then “How do you know?” The figure stays up — the reasoning only exists while they can still see it. Type what they say — their words, not your paraphrase. Ask, never tell; you are collecting how they see, not correcting it.</w:t>
+        <w:t>Hand the laptop over and let them type their own answers — exactly the way you handed yours to your partner in class. Sit beside them and ask “How do you know?” Ask, never tell; you are collecting how they see, not correcting it.</w:t>
       </w:r>
     </w:p>
     <w:p>
@@ -188,7 +197,7 @@
           <w:b/>
           <w:color w:val="1F4E96"/>
         </w:rPr>
-        <w:t xml:space="preserve">3.  </w:t>
+        <w:t xml:space="preserve">★ 3.  </w:t>
       </w:r>
       <w:r>
         <w:rPr>
@@ -211,7 +220,7 @@
           <w:b/>
           <w:color w:val="1F4E96"/>
         </w:rPr>
-        <w:t xml:space="preserve">4.  </w:t>
+        <w:t xml:space="preserve">★ 4.  </w:t>
       </w:r>
       <w:r>
         <w:rPr>
@@ -234,7 +243,7 @@
           <w:b/>
           <w:color w:val="1F4E96"/>
         </w:rPr>
-        <w:t xml:space="preserve">5.  </w:t>
+        <w:t xml:space="preserve">★ 5.  </w:t>
       </w:r>
       <w:r>
         <w:rPr>

</xml_diff>

<commit_message>
The exceptions move to the back of PE3
"If you collect fresh data" and the chatbot fallback sat between the intro and
the steps, so the first thing a student read after "you already did this" was
two paragraphs about going and doing it again. They now sit after What to
submit and before the rubric, where someone looks only if they need them.

Order is intro, what to do, what to submit, the two exceptions, rubric.

Co-Authored-By: Claude Opus 5 (1M context) <noreply@anthropic.com>
</commit_message>
<xml_diff>
--- a/week-3-geometry-van-hiele/week-3-pedagogical-excursion.docx
+++ b/week-3-geometry-van-hiele/week-3-pedagogical-excursion.docx
@@ -58,69 +58,6 @@
         <w:t>In class you posed a routine, handed the laptop over, and read what came back. If those answers are good enough to read — enough reasoning to place someone, not just labels — that transcript is your evidence and you are most of the way done. If they came back thin, or you missed the session, collect fresh data before Sunday: choose a routine that splits levels (build your own in nVoke, or use the built-in van Hiele Geometry pack) and pose it to one learner. A good routine is one where the answer alone won't tell you who's where, but the reasoning will.</w:t>
       </w:r>
     </w:p>
-    <w:p>
-      <w:pPr>
-        <w:pStyle w:val="Heading2"/>
-      </w:pPr>
-      <w:r>
-        <w:rPr>
-          <w:rFonts w:ascii="Calibri" w:hAnsi="Calibri"/>
-          <w:b/>
-          <w:color w:val="1F4E96"/>
-        </w:rPr>
-        <w:t>If you collect fresh data</w:t>
-      </w:r>
-    </w:p>
-    <w:p>
-      <w:r>
-        <w:rPr>
-          <w:rFonts w:ascii="Calibri" w:hAnsi="Calibri"/>
-          <w:b w:val="0"/>
-          <w:i w:val="0"/>
-        </w:rPr>
-        <w:t>A friend, a family member, or a child — anyone outside our 318P section. Someone who has studied van Hiele may perform a level rather than reveal one, so an outside learner gives you cleaner reasoning to read; that is the reason to go get some, not a rule about who counts. A young child is ideal but not required; an adult who hasn't thought about this since grade school works well too.</w:t>
-      </w:r>
-    </w:p>
-    <w:p/>
-    <w:tbl>
-      <w:tblPr>
-        <w:tblStyle w:val="TableGrid"/>
-        <w:tblW w:type="auto" w:w="0"/>
-        <w:tblLook w:firstColumn="1" w:firstRow="1" w:lastColumn="0" w:lastRow="0" w:noHBand="0" w:noVBand="1" w:val="04A0"/>
-      </w:tblPr>
-      <w:tblGrid>
-        <w:gridCol w:w="10512"/>
-      </w:tblGrid>
-      <w:tr>
-        <w:trPr>
-          <w:cantSplit/>
-        </w:trPr>
-        <w:tc>
-          <w:tcPr>
-            <w:tcW w:type="dxa" w:w="10512"/>
-            <w:shd w:val="clear" w:fill="FFF2CC"/>
-          </w:tcPr>
-          <w:p>
-            <w:r>
-              <w:rPr>
-                <w:rFonts w:ascii="Calibri" w:hAnsi="Calibri"/>
-                <w:b/>
-                <w:color w:val="1F4E96"/>
-              </w:rPr>
-              <w:t>If no real person is reachable</w:t>
-            </w:r>
-          </w:p>
-          <w:p>
-            <w:r>
-              <w:rPr>
-                <w:rFonts w:ascii="Calibri" w:hAnsi="Calibri"/>
-              </w:rPr>
-              <w:t>Paste your routine's prompt into a chatbot and have it play the learner. In the “What I would offer next” box, say clearly that it was a stand-in, and add two sentences: how did the AI's responses differ from a real person's — and what would you trust less? That box is free text, so it prints with the rest.</w:t>
-            </w:r>
-          </w:p>
-        </w:tc>
-      </w:tr>
-    </w:tbl>
     <w:p/>
     <w:p>
       <w:pPr>
@@ -291,6 +228,69 @@
         <w:t xml:space="preserve">of your learner's responses (no full names — first name or “the learner”), your van Hiele level claim with quoted evidence, the next experience you'd offer, and your reasoning (all of these are generated while using the nVoke app).</w:t>
       </w:r>
     </w:p>
+    <w:p>
+      <w:pPr>
+        <w:pStyle w:val="Heading2"/>
+      </w:pPr>
+      <w:r>
+        <w:rPr>
+          <w:rFonts w:ascii="Calibri" w:hAnsi="Calibri"/>
+          <w:b/>
+          <w:color w:val="1F4E96"/>
+        </w:rPr>
+        <w:t>If you collect fresh data</w:t>
+      </w:r>
+    </w:p>
+    <w:p>
+      <w:r>
+        <w:rPr>
+          <w:rFonts w:ascii="Calibri" w:hAnsi="Calibri"/>
+          <w:b w:val="0"/>
+          <w:i w:val="0"/>
+        </w:rPr>
+        <w:t>A friend, a family member, or a child — anyone outside our 318P section. Someone who has studied van Hiele may perform a level rather than reveal one, so an outside learner gives you cleaner reasoning to read; that is the reason to go get some, not a rule about who counts. A young child is ideal but not required; an adult who hasn't thought about this since grade school works well too.</w:t>
+      </w:r>
+    </w:p>
+    <w:p/>
+    <w:tbl>
+      <w:tblPr>
+        <w:tblStyle w:val="TableGrid"/>
+        <w:tblW w:type="auto" w:w="0"/>
+        <w:tblLook w:firstColumn="1" w:firstRow="1" w:lastColumn="0" w:lastRow="0" w:noHBand="0" w:noVBand="1" w:val="04A0"/>
+      </w:tblPr>
+      <w:tblGrid>
+        <w:gridCol w:w="10512"/>
+      </w:tblGrid>
+      <w:tr>
+        <w:trPr>
+          <w:cantSplit/>
+        </w:trPr>
+        <w:tc>
+          <w:tcPr>
+            <w:tcW w:type="dxa" w:w="10512"/>
+            <w:shd w:val="clear" w:fill="FFF2CC"/>
+          </w:tcPr>
+          <w:p>
+            <w:r>
+              <w:rPr>
+                <w:rFonts w:ascii="Calibri" w:hAnsi="Calibri"/>
+                <w:b/>
+                <w:color w:val="1F4E96"/>
+              </w:rPr>
+              <w:t>If no real person is reachable</w:t>
+            </w:r>
+          </w:p>
+          <w:p>
+            <w:r>
+              <w:rPr>
+                <w:rFonts w:ascii="Calibri" w:hAnsi="Calibri"/>
+              </w:rPr>
+              <w:t>Paste your routine's prompt into a chatbot and have it play the learner. In the “What I would offer next” box, say clearly that it was a stand-in, and add two sentences: how did the AI's responses differ from a real person's — and what would you trust less? That box is free text, so it prints with the rest.</w:t>
+            </w:r>
+          </w:p>
+        </w:tc>
+      </w:tr>
+    </w:tbl>
     <w:p>
       <w:pPr>
         <w:spacing w:after="120"/>

</xml_diff>